<commit_message>
Add gallery photos, Risk Analysis, and update Scope Statement
- Add CMS Build Day and Bed Delivery photos to gallery with lightbox viewer
- Compress images from 120MB to 16MB for web optimization
- Add Risk Analysis slideshow to docs page
- Re-upload updated Scope Statement

Co-Authored-By: Claude Opus 4.6 (1M context) <noreply@anthropic.com>
</commit_message>
<xml_diff>
--- a/docs/documents/planning/Scope Statement.docx
+++ b/docs/documents/planning/Scope Statement.docx
@@ -22,7 +22,7 @@
         <w:rPr>
           <w:rtl w:val="0"/>
         </w:rPr>
-        <w:t xml:space="preserve">0</w:t>
+        <w:t xml:space="preserve">1</w:t>
       </w:r>
       <w:r>
         <w:rPr>
@@ -268,7 +268,7 @@
       <w:tr>
         <w:trPr>
           <w:cantSplit w:val="0"/>
-          <w:trHeight w:val="899" w:hRule="atLeast"/>
+          <w:trHeight w:val="915" w:hRule="atLeast"/>
           <w:tblHeader w:val="0"/>
         </w:trPr>
         <w:tc>
@@ -615,7 +615,7 @@
               <w:rPr>
                 <w:rtl w:val="0"/>
               </w:rPr>
-              <w:t xml:space="preserve">ncluding defined roles, timelines, and milestones. This transparency combined with our effort will create success in our project.</w:t>
+              <w:t xml:space="preserve">ncluding defined roles, timelines, and milestones. In addition to our 40 beds-in-a-bag goal, we want to strive for a 9/10 likert scale from our sponsor to test our effectiveness as a group.</w:t>
             </w:r>
           </w:p>
           <w:p>
@@ -897,26 +897,12 @@
                 <w:vertAlign w:val="baseline"/>
                 <w:rtl w:val="0"/>
               </w:rPr>
-              <w:t xml:space="preserve">Product/Process-related deliverables: (</w:t>
-            </w:r>
-            <w:r>
-              <w:rPr>
-                <w:rFonts w:ascii="Times New Roman" w:cs="Times New Roman" w:eastAsia="Times New Roman" w:hAnsi="Times New Roman"/>
-                <w:b w:val="0"/>
-                <w:bCs w:val="0"/>
-                <w:i w:val="0"/>
-                <w:iCs w:val="0"/>
-                <w:smallCaps w:val="0"/>
-                <w:strike w:val="0"/>
-                <w:color w:val="000000"/>
-                <w:sz w:val="24"/>
-                <w:szCs w:val="24"/>
-                <w:u w:val="none"/>
-                <w:shd w:fill="auto" w:val="clear"/>
-                <w:vertAlign w:val="baseline"/>
-                <w:rtl w:val="0"/>
-              </w:rPr>
-              <w:t xml:space="preserve">fundraising event, success report, research reports, design documents, software code, hardware, event, donations, etc.)</w:t>
+              <w:t xml:space="preserve">Product/Process-related deliverables: </w:t>
+            </w:r>
+            <w:r>
+              <w:rPr>
+                <w:rtl w:val="0"/>
+              </w:rPr>
             </w:r>
           </w:p>
           <w:p>
@@ -1057,6 +1043,11 @@
               </w:rPr>
               <w:t xml:space="preserve">Successful Bed Deliveries</w:t>
             </w:r>
+          </w:p>
+          <w:p>
+            <w:pPr>
+              <w:rPr/>
+            </w:pPr>
             <w:r>
               <w:rPr>
                 <w:rtl w:val="0"/>
@@ -1083,7 +1074,6 @@
         <w:rPr>
           <w:b w:val="1"/>
           <w:bCs w:val="1"/>
-          <w:highlight w:val="yellow"/>
           <w:vertAlign w:val="baseline"/>
         </w:rPr>
       </w:pPr>
@@ -1098,10 +1088,9 @@
         <w:rPr>
           <w:b w:val="1"/>
           <w:bCs w:val="1"/>
-          <w:highlight w:val="yellow"/>
           <w:rtl w:val="0"/>
         </w:rPr>
-        <w:t xml:space="preserve">*Insert name and date here*</w:t>
+        <w:t xml:space="preserve">Paul Mele 2/28/2026</w:t>
       </w:r>
       <w:r>
         <w:rPr>

</xml_diff>